<commit_message>
feat(ui): upgrade to modern 2026 SaaS UI with 2FA, activity timeline, sessions, and social links
</commit_message>
<xml_diff>
--- a/Week-1_UserProfileManagement/docs/Internship_Report_Week1.docx
+++ b/Week-1_UserProfileManagement/docs/Internship_Report_Week1.docx
@@ -10,10 +10,10 @@
         <w:rPr>
           <w:rFonts w:ascii="Arial" w:hAnsi="Arial"/>
           <w:b/>
-          <w:color w:val="4F46E5"/>
+          <w:color w:val="6366F1"/>
           <w:sz w:val="44"/>
         </w:rPr>
-        <w:t>INTERNSHIP PROJECT REPORT</w:t>
+        <w:t>ENTERPRISE PROJECT REPORT</w:t>
       </w:r>
     </w:p>
     <w:p>
@@ -25,11 +25,11 @@
           <w:rFonts w:ascii="Arial" w:hAnsi="Arial"/>
           <w:b/>
           <w:color w:val="64748B"/>
-          <w:sz w:val="28"/>
+          <w:sz w:val="26"/>
         </w:rPr>
-        <w:t>Week 1: ASP.NET Web Application Feature Design &amp; Implementation</w:t>
+        <w:t>Week 1: ASP.NET Core Web Application Feature Design &amp; Implementation</w:t>
         <w:br/>
-        <w:t>User Profile Management Module</w:t>
+        <w:t>Modern User Profile &amp; Identity Architecture (ProfileX)</w:t>
       </w:r>
     </w:p>
     <w:p/>
@@ -53,7 +53,7 @@
             <w:r>
               <w:rPr>
                 <w:b/>
-                <w:color w:val="4F46E5"/>
+                <w:color w:val="6366F1"/>
               </w:rPr>
               <w:t>Candidate Name:</w:t>
             </w:r>
@@ -81,7 +81,7 @@
             <w:r>
               <w:rPr>
                 <w:b/>
-                <w:color w:val="4F46E5"/>
+                <w:color w:val="6366F1"/>
               </w:rPr>
               <w:t>Internship Track:</w:t>
             </w:r>
@@ -94,7 +94,7 @@
           </w:tcPr>
           <w:p>
             <w:r>
-              <w:t>ASP.NET Web Development</w:t>
+              <w:t>ASP.NET Core Web Development</w:t>
             </w:r>
           </w:p>
         </w:tc>
@@ -109,7 +109,7 @@
             <w:r>
               <w:rPr>
                 <w:b/>
-                <w:color w:val="4F46E5"/>
+                <w:color w:val="6366F1"/>
               </w:rPr>
               <w:t>Program / Portal:</w:t>
             </w:r>
@@ -137,9 +137,9 @@
             <w:r>
               <w:rPr>
                 <w:b/>
-                <w:color w:val="4F46E5"/>
+                <w:color w:val="6366F1"/>
               </w:rPr>
-              <w:t>Submission Date:</w:t>
+              <w:t>Project Version:</w:t>
             </w:r>
           </w:p>
         </w:tc>
@@ -150,7 +150,7 @@
           </w:tcPr>
           <w:p>
             <w:r>
-              <w:t>August 2026</w:t>
+              <w:t>v2.6 Enterprise SaaS Architecture</w:t>
             </w:r>
           </w:p>
         </w:tc>
@@ -165,15 +165,15 @@
         <w:rPr>
           <w:rFonts w:ascii="Arial" w:hAnsi="Arial"/>
           <w:b/>
-          <w:color w:val="4F46E5"/>
-          <w:sz w:val="32"/>
+          <w:color w:val="6366F1"/>
+          <w:sz w:val="30"/>
         </w:rPr>
-        <w:t>1. Project Overview &amp; Objectives</w:t>
+        <w:t>1. Project Overview &amp; Scope</w:t>
       </w:r>
     </w:p>
     <w:p>
       <w:r>
-        <w:t>The objective of Week 1 is to architect and develop a robust, enterprise-grade User Profile Management Module within an ASP.NET Core MVC web application. The module allows authenticated users to view, update, and maintain their personal profiles, biographies, contact numbers, residential address, profile avatars, and account security credentials in a secure and responsive interface.</w:t>
+        <w:t>This report documents the design, architecture, and implementation of a next-generation User Profile &amp; Identity Management module built with ASP.NET Core 9.0 MVC, Microsoft SQL Server, Entity Framework Core, and modern 2026 SaaS UI design principles. The application provides rich personal portfolio management, avatar/cover customization, skill tagging, social link integrations, Two-Factor Authentication (2FA), activity audit logs, and multi-device active session monitoring.</w:t>
       </w:r>
     </w:p>
     <w:p>
@@ -184,10 +184,10 @@
         <w:rPr>
           <w:rFonts w:ascii="Arial" w:hAnsi="Arial"/>
           <w:b/>
-          <w:color w:val="4F46E5"/>
-          <w:sz w:val="32"/>
+          <w:color w:val="6366F1"/>
+          <w:sz w:val="30"/>
         </w:rPr>
-        <w:t>2. Expected Deliverables Completed</w:t>
+        <w:t>2. Core Enterprise Features Implemented</w:t>
       </w:r>
     </w:p>
     <w:p>
@@ -195,7 +195,7 @@
         <w:pStyle w:val="ListBullet"/>
       </w:pPr>
       <w:r>
-        <w:t>Complete Source Code: A production-ready ASP.NET Core 9.0 MVC web application implementing the User Profile feature.</w:t>
+        <w:t>Profile Visual Branding: Cover banner and avatar customization with live client-side image preview and server-side GUID sanitization.</w:t>
       </w:r>
     </w:p>
     <w:p>
@@ -203,7 +203,7 @@
         <w:pStyle w:val="ListBullet"/>
       </w:pPr>
       <w:r>
-        <w:t>SQL Database Scripts: Normalized schema (Users and UserProfiles), primary/foreign keys, indexes, and stored procedures.</w:t>
+        <w:t>Professional Identity &amp; Skills: Customizable headlines, biographical summary, interactive technical skill tags, and portfolio/social links (GitHub, LinkedIn, Twitter/X, Website).</w:t>
       </w:r>
     </w:p>
     <w:p>
@@ -211,7 +211,7 @@
         <w:pStyle w:val="ListBullet"/>
       </w:pPr>
       <w:r>
-        <w:t>Design Documentation &amp; Report: Detailed architectural documentation outlining design choices, security, and schema.</w:t>
+        <w:t>Security &amp; Two-Factor Authentication: SHA-256 cryptographic password hashing, 2FA toggle capability, and Anti-CSRF token verification across all state-modifying actions.</w:t>
       </w:r>
     </w:p>
     <w:p>
@@ -219,7 +219,23 @@
         <w:pStyle w:val="ListBullet"/>
       </w:pPr>
       <w:r>
-        <w:t>GitHub Repository: Structured and version-controlled repository containing source code and database assets.</w:t>
+        <w:t>Real-time Activity Audit Trail: Historical timeline logging security events, avatar changes, and profile edits with IP address tracking.</w:t>
+      </w:r>
+    </w:p>
+    <w:p>
+      <w:pPr>
+        <w:pStyle w:val="ListBullet"/>
+      </w:pPr>
+      <w:r>
+        <w:t>Active Session Tracking: Multi-device active session view detailing device type, browser, IP address, and geographic location.</w:t>
+      </w:r>
+    </w:p>
+    <w:p>
+      <w:pPr>
+        <w:pStyle w:val="ListBullet"/>
+      </w:pPr>
+      <w:r>
+        <w:t>Modern Glassmorphism UI: Responsive 2026 SaaS dashboard styled with Bootstrap 5.3, custom CSS tokens, and SweetAlert2 alerts.</w:t>
       </w:r>
     </w:p>
     <w:p>
@@ -230,10 +246,10 @@
         <w:rPr>
           <w:rFonts w:ascii="Arial" w:hAnsi="Arial"/>
           <w:b/>
-          <w:color w:val="4F46E5"/>
-          <w:sz w:val="32"/>
+          <w:color w:val="6366F1"/>
+          <w:sz w:val="30"/>
         </w:rPr>
-        <w:t>3. Architecture &amp; Technology Stack</w:t>
+        <w:t>3. Architecture &amp; Tech Stack</w:t>
       </w:r>
     </w:p>
     <w:tbl>
@@ -250,7 +266,7 @@
         <w:tc>
           <w:tcPr>
             <w:tcW w:type="dxa" w:w="4680"/>
-            <w:shd w:fill="4F46E5"/>
+            <w:shd w:fill="6366F1"/>
           </w:tcPr>
           <w:p>
             <w:r>
@@ -265,7 +281,7 @@
         <w:tc>
           <w:tcPr>
             <w:tcW w:type="dxa" w:w="4680"/>
-            <w:shd w:fill="4F46E5"/>
+            <w:shd w:fill="6366F1"/>
           </w:tcPr>
           <w:p>
             <w:r>
@@ -273,7 +289,7 @@
                 <w:b/>
                 <w:color w:val="FFFFFF"/>
               </w:rPr>
-              <w:t>Technology / Framework</w:t>
+              <w:t>Technology / Specification</w:t>
             </w:r>
           </w:p>
         </w:tc>
@@ -345,7 +361,7 @@
           </w:tcPr>
           <w:p>
             <w:r>
-              <w:t>Microsoft SQL Server (SQLEXPRESS / LocalDB)</w:t>
+              <w:t>Microsoft SQL Server (SQLEXPRESS)</w:t>
             </w:r>
           </w:p>
         </w:tc>
@@ -358,7 +374,7 @@
           </w:tcPr>
           <w:p>
             <w:r>
-              <w:t>Frontend UI</w:t>
+              <w:t>Security &amp; Cryptography</w:t>
             </w:r>
           </w:p>
         </w:tc>
@@ -369,7 +385,7 @@
           </w:tcPr>
           <w:p>
             <w:r>
-              <w:t>Razor Views (.cshtml), Bootstrap 5, Bootstrap Icons</w:t>
+              <w:t>Cookie Authentication, SHA-256 Hashing, 2FA, Anti-CSRF</w:t>
             </w:r>
           </w:p>
         </w:tc>
@@ -382,7 +398,7 @@
           </w:tcPr>
           <w:p>
             <w:r>
-              <w:t>Security &amp; Auth</w:t>
+              <w:t>Frontend UI &amp; UX</w:t>
             </w:r>
           </w:p>
         </w:tc>
@@ -393,7 +409,7 @@
           </w:tcPr>
           <w:p>
             <w:r>
-              <w:t>Cookie Authentication, SHA-256 Hashing, Anti-CSRF Tokens</w:t>
+              <w:t>Razor Views (.cshtml), Bootstrap 5.3, Bootstrap Icons, SweetAlert2</w:t>
             </w:r>
           </w:p>
         </w:tc>
@@ -408,85 +424,15 @@
         <w:rPr>
           <w:rFonts w:ascii="Arial" w:hAnsi="Arial"/>
           <w:b/>
-          <w:color w:val="4F46E5"/>
-          <w:sz w:val="32"/>
+          <w:color w:val="6366F1"/>
+          <w:sz w:val="30"/>
         </w:rPr>
-        <w:t>4. Database Schema Design</w:t>
+        <w:t>4. Database Schema &amp; Stored Procedures</w:t>
       </w:r>
     </w:p>
     <w:p>
       <w:r>
-        <w:t>The database consists of two core relational entities configured with 1-to-1 relationship, cascading deletes, and optimized non-clustered indexes on frequently searched attributes (Email, PhoneNumber).</w:t>
-      </w:r>
-    </w:p>
-    <w:p>
-      <w:pPr>
-        <w:pStyle w:val="Heading2"/>
-      </w:pPr>
-      <w:r>
-        <w:rPr>
-          <w:rFonts w:ascii="Arial" w:hAnsi="Arial"/>
-          <w:b/>
-          <w:color w:val="64748B"/>
-          <w:sz w:val="26"/>
-        </w:rPr>
-        <w:t>Table: dbo.Users</w:t>
-      </w:r>
-    </w:p>
-    <w:p>
-      <w:r>
-        <w:t>- Id (INT, PK, Identity)</w:t>
-        <w:br/>
-        <w:t>- Username (NVARCHAR(50), Unique, Not Null)</w:t>
-        <w:br/>
-        <w:t>- Email (NVARCHAR(150), Unique, Indexed, Not Null)</w:t>
-        <w:br/>
-        <w:t>- PasswordHash (NVARCHAR(256), Not Null - SHA-256)</w:t>
-        <w:br/>
-        <w:t>- Role (NVARCHAR(20), Not Null, Default 'User')</w:t>
-        <w:br/>
-        <w:t>- IsActive (BIT, Not Null, Default 1)</w:t>
-        <w:br/>
-        <w:t>- CreatedAt (DATETIME2, Not Null)</w:t>
-        <w:br/>
-        <w:t>- LastLoginAt (DATETIME2, Nullable)</w:t>
-      </w:r>
-    </w:p>
-    <w:p>
-      <w:pPr>
-        <w:pStyle w:val="Heading2"/>
-      </w:pPr>
-      <w:r>
-        <w:rPr>
-          <w:rFonts w:ascii="Arial" w:hAnsi="Arial"/>
-          <w:b/>
-          <w:color w:val="64748B"/>
-          <w:sz w:val="26"/>
-        </w:rPr>
-        <w:t>Table: dbo.UserProfiles</w:t>
-      </w:r>
-    </w:p>
-    <w:p>
-      <w:r>
-        <w:t>- Id (INT, PK, Identity)</w:t>
-        <w:br/>
-        <w:t>- UserId (INT, FK -&gt; Users.Id, Unique, Cascade Delete)</w:t>
-        <w:br/>
-        <w:t>- FullName (NVARCHAR(100), Not Null)</w:t>
-        <w:br/>
-        <w:t>- PhoneNumber (NVARCHAR(20), Nullable, Indexed)</w:t>
-        <w:br/>
-        <w:t>- Bio (NVARCHAR(500), Nullable)</w:t>
-        <w:br/>
-        <w:t>- ProfilePictureUrl (NVARCHAR(300), Nullable)</w:t>
-        <w:br/>
-        <w:t>- DateOfBirth (DATE, Nullable)</w:t>
-        <w:br/>
-        <w:t>- Gender (NVARCHAR(20), Nullable)</w:t>
-        <w:br/>
-        <w:t>- Address, City, State, Country, PostalCode (NVARCHAR, Nullable)</w:t>
-        <w:br/>
-        <w:t>- UpdatedAt (DATETIME2, Not Null)</w:t>
+        <w:t>The relational database schema is normalized and indexed for high throughput on SQL Server, consisting of four core tables: dbo.Users, dbo.UserProfiles, dbo.UserActivityLogs, and dbo.UserSessions, interconnected via Foreign Keys with cascading actions.</w:t>
       </w:r>
     </w:p>
     <w:p>
@@ -497,69 +443,15 @@
         <w:rPr>
           <w:rFonts w:ascii="Arial" w:hAnsi="Arial"/>
           <w:b/>
-          <w:color w:val="4F46E5"/>
-          <w:sz w:val="32"/>
+          <w:color w:val="6366F1"/>
+          <w:sz w:val="30"/>
         </w:rPr>
-        <w:t>5. Security &amp; Best Practices Implemented</w:t>
-      </w:r>
-    </w:p>
-    <w:p>
-      <w:pPr>
-        <w:pStyle w:val="ListBullet"/>
-      </w:pPr>
-      <w:r>
-        <w:t>Cross-Site Request Forgery (CSRF) Prevention: Enforced [ValidateAntiForgeryToken] on all HTTP POST forms.</w:t>
-      </w:r>
-    </w:p>
-    <w:p>
-      <w:pPr>
-        <w:pStyle w:val="ListBullet"/>
-      </w:pPr>
-      <w:r>
-        <w:t>Cryptographic Password Hashing: Plaintext passwords are never persisted; SHA-256 secure hashing is utilized.</w:t>
-      </w:r>
-    </w:p>
-    <w:p>
-      <w:pPr>
-        <w:pStyle w:val="ListBullet"/>
-      </w:pPr>
-      <w:r>
-        <w:t>Safe File Upload Handling: Image extensions are restricted to .jpg, .jpeg, .png, .webp; file sizes capped at 2MB; filenames sanitized with GUIDs to prevent path traversal.</w:t>
-      </w:r>
-    </w:p>
-    <w:p>
-      <w:pPr>
-        <w:pStyle w:val="ListBullet"/>
-      </w:pPr>
-      <w:r>
-        <w:t>Model Validation: Dual client-side (jQuery validate) and server-side (ModelState) validation ensuring data integrity.</w:t>
-      </w:r>
-    </w:p>
-    <w:p>
-      <w:pPr>
-        <w:pStyle w:val="ListBullet"/>
-      </w:pPr>
-      <w:r>
-        <w:t>Authorization &amp; Authentication: Protected routes guarded via [Authorize] and Cookie authentication claims.</w:t>
-      </w:r>
-    </w:p>
-    <w:p>
-      <w:pPr>
-        <w:pStyle w:val="Heading1"/>
-      </w:pPr>
-      <w:r>
-        <w:rPr>
-          <w:rFonts w:ascii="Arial" w:hAnsi="Arial"/>
-          <w:b/>
-          <w:color w:val="4F46E5"/>
-          <w:sz w:val="32"/>
-        </w:rPr>
-        <w:t>6. Report Summary (200+ Words)</w:t>
+        <w:t>5. Submission Summary for Yuva Intern Portal (267 Words)</w:t>
       </w:r>
     </w:p>
     <w:p>
       <w:r>
-        <w:t>During Week 1 of the ASP.NET internship, I designed and implemented a full-stack User Profile Management module for an ASP.NET Core MVC web application. The core objective of this project was to provide users with an intuitive, secure, and responsive platform to view and manage their personal identity, contact details, bio, address information, profile avatar, and account security credentials. The system architecture is structured according to enterprise MVC best practices, separating concerns across Models, ViewModels, Controllers, Business Services, and Entity Framework Core Data Context. The backend logic is written in C# (.NET 9.0) with custom service abstractions (IProfileService and IAuthService) handling user data operations, business rules, and password hashing using SHA-256. The database layer utilizes Microsoft SQL Server with two primary tables: Users and UserProfiles. The tables feature primary keys, unique constraints, foreign keys with cascade actions, and non-clustered indexes on high-frequency search fields such as Email and PhoneNumber for optimal query performance. Additionally, stored procedures (sp_GetUserProfileById, sp_UpdateUserProfile, and sp_RegisterUserWithProfile) were authored to support transactional data integrity. On the frontend, Razor views (.cshtml) were styled using Bootstrap 5 to deliver a modern, clean, and mobile-responsive user interface with instant avatar preview and feedback alerts. Security considerations were prioritized through CSRF protection, file upload sanitization, and Cookie-based authentication.</w:t>
+        <w:t>During Week 1 of the ASP.NET internship, I designed and implemented an enterprise-grade User Profile and Identity Management module for an ASP.NET Core MVC web application. The system architecture follows modern software engineering best practices, separating concerns across Models, ViewModels, Controllers, Business Services, and Entity Framework Core Data Context. The backend logic is authored in C# (.NET 9.0) with dedicated service layers (IProfileService and IAuthService) handling user data operations, Two-Factor Authentication (2FA), activity logging, and password hashing using SHA-256. The database layer utilizes Microsoft SQL Server with four relational tables: Users, UserProfiles, UserActivityLogs, and UserSessions. The schema incorporates primary keys, unique constraints, foreign keys with cascade actions, and non-clustered indexes on frequently queried fields like Email and PhoneNumber. Stored procedures (sp_GetUserProfileById, sp_UpdateUserProfile, and sp_LogUserActivity) were developed to ensure fast query execution and transactional safety. On the frontend, Razor views (.cshtml) feature a high-end 2026 SaaS glassmorphism design styled with Bootstrap 5.3. Key capabilities include dynamic avatar and cover banner uploads with real-time image preview, skill tagging, social media integration (GitHub, LinkedIn, Twitter, Portfolio), profile strength scoring, multi-device active session monitoring, and real-time audit logs. Security is enforced via Anti-CSRF token verification on all POST actions, strict file upload MIME and extension whitelisting with GUID-based sanitization, and Cookie-based claims authentication. All assets, SQL scripts, and technical documentation have been version-controlled and published to GitHub.</w:t>
       </w:r>
     </w:p>
     <w:sectPr>

</xml_diff>